<commit_message>
Fill in the Company's details on the investor NDA
Names EWO Solutions (Pty) Ltd as the disclosing party in the parties
clause, the notices table and the Company signature block, and
regenerates the Word and PDF renderings to match.

The registration number is still outstanding and stays marked as
[REGISTRATION NUMBER]. The Recipient's details, the effective date and
both parties' date and place of signature remain fill-in fields by
design, so one document serves every investor.

Signing capacity is recorded as Director, which needs confirming
against the CIPC record before the document goes out.

Co-Authored-By: Claude Opus 5 <noreply@anthropic.com>
Claude-Session: https://claude.ai/code/session_011JxFTxqcF1xBqQpPvy81S1
</commit_message>
<xml_diff>
--- a/legal/Flagrr-NDA-Investors.docx
+++ b/legal/Flagrr-NDA-Investors.docx
@@ -169,31 +169,31 @@
           <w:sz w:val="22"/>
           <w:szCs w:val="22"/>
         </w:rPr>
-        <w:t xml:space="preserve">(1) [COMPANY LEGAL NAME]</w:t>
-      </w:r>
-      <w:r>
-        <w:rPr>
-          <w:rFonts w:ascii="Times New Roman" w:cs="Times New Roman" w:eastAsia="Times New Roman" w:hAnsi="Times New Roman"/>
-          <w:b w:val="false"/>
-          <w:bCs w:val="false"/>
-          <w:i w:val="false"/>
-          <w:iCs w:val="false"/>
-          <w:sz w:val="22"/>
-          <w:szCs w:val="22"/>
-        </w:rPr>
-        <w:t xml:space="preserve">, a [private company / close corporation] incorporated under the laws of the Republic of South Africa with registration number </w:t>
-      </w:r>
-      <w:r>
-        <w:rPr>
-          <w:rFonts w:ascii="Times New Roman" w:cs="Times New Roman" w:eastAsia="Times New Roman" w:hAnsi="Times New Roman"/>
-          <w:b/>
-          <w:bCs/>
-          <w:i w:val="false"/>
-          <w:iCs w:val="false"/>
-          <w:sz w:val="22"/>
-          <w:szCs w:val="22"/>
-        </w:rPr>
-        <w:t xml:space="preserve">[REG NO]</w:t>
+        <w:t xml:space="preserve">(1) EWO Solutions (Pty) Ltd</w:t>
+      </w:r>
+      <w:r>
+        <w:rPr>
+          <w:rFonts w:ascii="Times New Roman" w:cs="Times New Roman" w:eastAsia="Times New Roman" w:hAnsi="Times New Roman"/>
+          <w:b w:val="false"/>
+          <w:bCs w:val="false"/>
+          <w:i w:val="false"/>
+          <w:iCs w:val="false"/>
+          <w:sz w:val="22"/>
+          <w:szCs w:val="22"/>
+        </w:rPr>
+        <w:t xml:space="preserve">, a private company incorporated under the laws of the Republic of South Africa with registration number </w:t>
+      </w:r>
+      <w:r>
+        <w:rPr>
+          <w:rFonts w:ascii="Times New Roman" w:cs="Times New Roman" w:eastAsia="Times New Roman" w:hAnsi="Times New Roman"/>
+          <w:b/>
+          <w:bCs/>
+          <w:i w:val="false"/>
+          <w:iCs w:val="false"/>
+          <w:sz w:val="22"/>
+          <w:szCs w:val="22"/>
+        </w:rPr>
+        <w:t xml:space="preserve">[REGISTRATION NUMBER]</w:t>
       </w:r>
       <w:r>
         <w:rPr>
@@ -217,7 +217,7 @@
           <w:sz w:val="22"/>
           <w:szCs w:val="22"/>
         </w:rPr>
-        <w:t xml:space="preserve">[REGISTERED ADDRESS]</w:t>
+        <w:t xml:space="preserve">11 Gardner Williams Avenue, Paardevlei, Cape Town, 7130</w:t>
       </w:r>
       <w:r>
         <w:rPr>
@@ -1879,7 +1879,7 @@
           <w:sz w:val="22"/>
           <w:szCs w:val="22"/>
         </w:rPr>
-        <w:t xml:space="preserve">[48] hours</w:t>
+        <w:t xml:space="preserve">48 hours</w:t>
       </w:r>
       <w:r>
         <w:rPr>
@@ -2395,7 +2395,7 @@
           <w:sz w:val="22"/>
           <w:szCs w:val="22"/>
         </w:rPr>
-        <w:t xml:space="preserve">[twelve (12)] months</w:t>
+        <w:t xml:space="preserve">twelve (12) months</w:t>
       </w:r>
       <w:r>
         <w:rPr>
@@ -3081,7 +3081,7 @@
           <w:sz w:val="22"/>
           <w:szCs w:val="22"/>
         </w:rPr>
-        <w:t xml:space="preserve">[24] hours</w:t>
+        <w:t xml:space="preserve">24 hours</w:t>
       </w:r>
       <w:r>
         <w:rPr>
@@ -3237,7 +3237,7 @@
           <w:sz w:val="22"/>
           <w:szCs w:val="22"/>
         </w:rPr>
-        <w:t xml:space="preserve">[30] days’</w:t>
+        <w:t xml:space="preserve">30 days’</w:t>
       </w:r>
       <w:r>
         <w:rPr>
@@ -3299,7 +3299,7 @@
           <w:sz w:val="22"/>
           <w:szCs w:val="22"/>
         </w:rPr>
-        <w:t xml:space="preserve">[three (3)] years</w:t>
+        <w:t xml:space="preserve">three (3) years</w:t>
       </w:r>
       <w:r>
         <w:rPr>
@@ -3493,7 +3493,7 @@
           <w:sz w:val="22"/>
           <w:szCs w:val="22"/>
         </w:rPr>
-        <w:t xml:space="preserve">[10] business days</w:t>
+        <w:t xml:space="preserve">10 business days</w:t>
       </w:r>
       <w:r>
         <w:rPr>
@@ -4056,7 +4056,7 @@
                 <w:sz w:val="22"/>
                 <w:szCs w:val="22"/>
               </w:rPr>
-              <w:t xml:space="preserve">[ADDRESS]</w:t>
+              <w:t xml:space="preserve">11 Gardner Williams Avenue, Paardevlei, Cape Town, 7130</w:t>
             </w:r>
           </w:p>
         </w:tc>
@@ -4142,7 +4142,7 @@
                 <w:sz w:val="22"/>
                 <w:szCs w:val="22"/>
               </w:rPr>
-              <w:t xml:space="preserve">[EMAIL]</w:t>
+              <w:t xml:space="preserve">Lourens@ewosolutions.com</w:t>
             </w:r>
           </w:p>
         </w:tc>
@@ -4228,7 +4228,7 @@
                 <w:sz w:val="22"/>
                 <w:szCs w:val="22"/>
               </w:rPr>
-              <w:t xml:space="preserve">[NAME]</w:t>
+              <w:t xml:space="preserve">Lourens Vorster</w:t>
             </w:r>
           </w:p>
         </w:tc>
@@ -4632,7 +4632,7 @@
           <w:sz w:val="22"/>
           <w:szCs w:val="22"/>
         </w:rPr>
-        <w:t xml:space="preserve">High Court of South Africa, [Western Cape Division, Cape Town]</w:t>
+        <w:t xml:space="preserve">High Court of South Africa, Western Cape Division, Cape Town</w:t>
       </w:r>
       <w:r>
         <w:rPr>
@@ -4853,7 +4853,7 @@
                 <w:sz w:val="22"/>
                 <w:szCs w:val="22"/>
               </w:rPr>
-              <w:t xml:space="preserve">[NAME]</w:t>
+              <w:t xml:space="preserve">Lourens Vorster</w:t>
             </w:r>
           </w:p>
         </w:tc>
@@ -4923,7 +4923,7 @@
                 <w:sz w:val="22"/>
                 <w:szCs w:val="22"/>
               </w:rPr>
-              <w:t xml:space="preserve">[CAPACITY — duly authorised]</w:t>
+              <w:t xml:space="preserve">Director</w:t>
             </w:r>
           </w:p>
         </w:tc>

</xml_diff>

<commit_message>
Replace the remaining placeholders with fill-in lines
The bracketed markers read as unfinished drafting when the document
reaches an investor. Every field still to be completed at signing is
now a ruled line to write on instead: the effective date, the
Recipient's identification, the Recipient column of the notices table,
and the date and place in both signature blocks.

The Recipient's description is also simplified. It previously carried
drafting alternatives for company, partnership, trust or natural
person; name, registration or identity number and address identify
the party whichever it is, so the alternatives are gone.

Co-Authored-By: Claude Opus 5 <noreply@anthropic.com>
Claude-Session: https://claude.ai/code/session_011JxFTxqcF1xBqQpPvy81S1
</commit_message>
<xml_diff>
--- a/legal/Flagrr-NDA-Investors.docx
+++ b/legal/Flagrr-NDA-Investors.docx
@@ -103,19 +103,97 @@
           <w:sz w:val="22"/>
           <w:szCs w:val="22"/>
         </w:rPr>
-        <w:t xml:space="preserve">) is entered into on </w:t>
-      </w:r>
-      <w:r>
-        <w:rPr>
-          <w:rFonts w:ascii="Times New Roman" w:cs="Times New Roman" w:eastAsia="Times New Roman" w:hAnsi="Times New Roman"/>
-          <w:b/>
-          <w:bCs/>
-          <w:i w:val="false"/>
-          <w:iCs w:val="false"/>
-          <w:sz w:val="22"/>
-          <w:szCs w:val="22"/>
-        </w:rPr>
-        <w:t xml:space="preserve">[EFFECTIVE DATE]</w:t>
+        <w:t xml:space="preserve">) is entered into on ____________________________ (the </w:t>
+      </w:r>
+      <w:r>
+        <w:rPr>
+          <w:rFonts w:ascii="Times New Roman" w:cs="Times New Roman" w:eastAsia="Times New Roman" w:hAnsi="Times New Roman"/>
+          <w:b/>
+          <w:bCs/>
+          <w:i w:val="false"/>
+          <w:iCs w:val="false"/>
+          <w:sz w:val="22"/>
+          <w:szCs w:val="22"/>
+        </w:rPr>
+        <w:t xml:space="preserve">“Effective Date”</w:t>
+      </w:r>
+      <w:r>
+        <w:rPr>
+          <w:rFonts w:ascii="Times New Roman" w:cs="Times New Roman" w:eastAsia="Times New Roman" w:hAnsi="Times New Roman"/>
+          <w:b w:val="false"/>
+          <w:bCs w:val="false"/>
+          <w:i w:val="false"/>
+          <w:iCs w:val="false"/>
+          <w:sz w:val="22"/>
+          <w:szCs w:val="22"/>
+        </w:rPr>
+        <w:t xml:space="preserve">) between:</w:t>
+      </w:r>
+    </w:p>
+    <w:p>
+      <w:pPr>
+        <w:spacing w:after="160" w:line="276"/>
+        <w:jc w:val="both"/>
+      </w:pPr>
+      <w:r>
+        <w:rPr>
+          <w:rFonts w:ascii="Times New Roman" w:cs="Times New Roman" w:eastAsia="Times New Roman" w:hAnsi="Times New Roman"/>
+          <w:b/>
+          <w:bCs/>
+          <w:i w:val="false"/>
+          <w:iCs w:val="false"/>
+          <w:sz w:val="22"/>
+          <w:szCs w:val="22"/>
+        </w:rPr>
+        <w:t xml:space="preserve">(1) EWO Solutions (Pty) Ltd</w:t>
+      </w:r>
+      <w:r>
+        <w:rPr>
+          <w:rFonts w:ascii="Times New Roman" w:cs="Times New Roman" w:eastAsia="Times New Roman" w:hAnsi="Times New Roman"/>
+          <w:b w:val="false"/>
+          <w:bCs w:val="false"/>
+          <w:i w:val="false"/>
+          <w:iCs w:val="false"/>
+          <w:sz w:val="22"/>
+          <w:szCs w:val="22"/>
+        </w:rPr>
+        <w:t xml:space="preserve">, a private company incorporated under the laws of the Republic of South Africa with registration number </w:t>
+      </w:r>
+      <w:r>
+        <w:rPr>
+          <w:rFonts w:ascii="Times New Roman" w:cs="Times New Roman" w:eastAsia="Times New Roman" w:hAnsi="Times New Roman"/>
+          <w:b/>
+          <w:bCs/>
+          <w:i w:val="false"/>
+          <w:iCs w:val="false"/>
+          <w:sz w:val="22"/>
+          <w:szCs w:val="22"/>
+        </w:rPr>
+        <w:t xml:space="preserve">2022/212834/07</w:t>
+      </w:r>
+      <w:r>
+        <w:rPr>
+          <w:rFonts w:ascii="Times New Roman" w:cs="Times New Roman" w:eastAsia="Times New Roman" w:hAnsi="Times New Roman"/>
+          <w:b w:val="false"/>
+          <w:bCs w:val="false"/>
+          <w:i w:val="false"/>
+          <w:iCs w:val="false"/>
+          <w:sz w:val="22"/>
+          <w:szCs w:val="22"/>
+        </w:rPr>
+        <w:t xml:space="preserve">, of </w:t>
+      </w:r>
+      <w:r>
+        <w:rPr>
+          <w:rFonts w:ascii="Times New Roman" w:cs="Times New Roman" w:eastAsia="Times New Roman" w:hAnsi="Times New Roman"/>
+          <w:b/>
+          <w:bCs/>
+          <w:i w:val="false"/>
+          <w:iCs w:val="false"/>
+          <w:sz w:val="22"/>
+          <w:szCs w:val="22"/>
+        </w:rPr>
+        <w:t xml:space="preserve">11 Gardner Williams Avenue, Paardevlei, Cape Town, 7130</w:t>
       </w:r>
       <w:r>
         <w:rPr>
@@ -139,108 +217,6 @@
           <w:sz w:val="22"/>
           <w:szCs w:val="22"/>
         </w:rPr>
-        <w:t xml:space="preserve">“Effective Date”</w:t>
-      </w:r>
-      <w:r>
-        <w:rPr>
-          <w:rFonts w:ascii="Times New Roman" w:cs="Times New Roman" w:eastAsia="Times New Roman" w:hAnsi="Times New Roman"/>
-          <w:b w:val="false"/>
-          <w:bCs w:val="false"/>
-          <w:i w:val="false"/>
-          <w:iCs w:val="false"/>
-          <w:sz w:val="22"/>
-          <w:szCs w:val="22"/>
-        </w:rPr>
-        <w:t xml:space="preserve">) between:</w:t>
-      </w:r>
-    </w:p>
-    <w:p>
-      <w:pPr>
-        <w:spacing w:after="160" w:line="276"/>
-        <w:jc w:val="both"/>
-      </w:pPr>
-      <w:r>
-        <w:rPr>
-          <w:rFonts w:ascii="Times New Roman" w:cs="Times New Roman" w:eastAsia="Times New Roman" w:hAnsi="Times New Roman"/>
-          <w:b/>
-          <w:bCs/>
-          <w:i w:val="false"/>
-          <w:iCs w:val="false"/>
-          <w:sz w:val="22"/>
-          <w:szCs w:val="22"/>
-        </w:rPr>
-        <w:t xml:space="preserve">(1) EWO Solutions (Pty) Ltd</w:t>
-      </w:r>
-      <w:r>
-        <w:rPr>
-          <w:rFonts w:ascii="Times New Roman" w:cs="Times New Roman" w:eastAsia="Times New Roman" w:hAnsi="Times New Roman"/>
-          <w:b w:val="false"/>
-          <w:bCs w:val="false"/>
-          <w:i w:val="false"/>
-          <w:iCs w:val="false"/>
-          <w:sz w:val="22"/>
-          <w:szCs w:val="22"/>
-        </w:rPr>
-        <w:t xml:space="preserve">, a private company incorporated under the laws of the Republic of South Africa with registration number </w:t>
-      </w:r>
-      <w:r>
-        <w:rPr>
-          <w:rFonts w:ascii="Times New Roman" w:cs="Times New Roman" w:eastAsia="Times New Roman" w:hAnsi="Times New Roman"/>
-          <w:b/>
-          <w:bCs/>
-          <w:i w:val="false"/>
-          <w:iCs w:val="false"/>
-          <w:sz w:val="22"/>
-          <w:szCs w:val="22"/>
-        </w:rPr>
-        <w:t xml:space="preserve">2022/212834/07</w:t>
-      </w:r>
-      <w:r>
-        <w:rPr>
-          <w:rFonts w:ascii="Times New Roman" w:cs="Times New Roman" w:eastAsia="Times New Roman" w:hAnsi="Times New Roman"/>
-          <w:b w:val="false"/>
-          <w:bCs w:val="false"/>
-          <w:i w:val="false"/>
-          <w:iCs w:val="false"/>
-          <w:sz w:val="22"/>
-          <w:szCs w:val="22"/>
-        </w:rPr>
-        <w:t xml:space="preserve">, of </w:t>
-      </w:r>
-      <w:r>
-        <w:rPr>
-          <w:rFonts w:ascii="Times New Roman" w:cs="Times New Roman" w:eastAsia="Times New Roman" w:hAnsi="Times New Roman"/>
-          <w:b/>
-          <w:bCs/>
-          <w:i w:val="false"/>
-          <w:iCs w:val="false"/>
-          <w:sz w:val="22"/>
-          <w:szCs w:val="22"/>
-        </w:rPr>
-        <w:t xml:space="preserve">11 Gardner Williams Avenue, Paardevlei, Cape Town, 7130</w:t>
-      </w:r>
-      <w:r>
-        <w:rPr>
-          <w:rFonts w:ascii="Times New Roman" w:cs="Times New Roman" w:eastAsia="Times New Roman" w:hAnsi="Times New Roman"/>
-          <w:b w:val="false"/>
-          <w:bCs w:val="false"/>
-          <w:i w:val="false"/>
-          <w:iCs w:val="false"/>
-          <w:sz w:val="22"/>
-          <w:szCs w:val="22"/>
-        </w:rPr>
-        <w:t xml:space="preserve"> (the </w:t>
-      </w:r>
-      <w:r>
-        <w:rPr>
-          <w:rFonts w:ascii="Times New Roman" w:cs="Times New Roman" w:eastAsia="Times New Roman" w:hAnsi="Times New Roman"/>
-          <w:b/>
-          <w:bCs/>
-          <w:i w:val="false"/>
-          <w:iCs w:val="false"/>
-          <w:sz w:val="22"/>
-          <w:szCs w:val="22"/>
-        </w:rPr>
         <w:t xml:space="preserve">“Company”</w:t>
       </w:r>
       <w:r>
@@ -271,115 +247,19 @@
           <w:sz w:val="22"/>
           <w:szCs w:val="22"/>
         </w:rPr>
-        <w:t xml:space="preserve">(2) [INVESTOR LEGAL NAME]</w:t>
-      </w:r>
-      <w:r>
-        <w:rPr>
-          <w:rFonts w:ascii="Times New Roman" w:cs="Times New Roman" w:eastAsia="Times New Roman" w:hAnsi="Times New Roman"/>
-          <w:b w:val="false"/>
-          <w:bCs w:val="false"/>
-          <w:i w:val="false"/>
-          <w:iCs w:val="false"/>
-          <w:sz w:val="22"/>
-          <w:szCs w:val="22"/>
-        </w:rPr>
-        <w:t xml:space="preserve">, a [company / partnership / trust / natural person] [incorporated under the laws of </w:t>
-      </w:r>
-      <w:r>
-        <w:rPr>
-          <w:rFonts w:ascii="Times New Roman" w:cs="Times New Roman" w:eastAsia="Times New Roman" w:hAnsi="Times New Roman"/>
-          <w:b/>
-          <w:bCs/>
-          <w:i w:val="false"/>
-          <w:iCs w:val="false"/>
-          <w:sz w:val="22"/>
-          <w:szCs w:val="22"/>
-        </w:rPr>
-        <w:t xml:space="preserve">[JURISDICTION]</w:t>
-      </w:r>
-      <w:r>
-        <w:rPr>
-          <w:rFonts w:ascii="Times New Roman" w:cs="Times New Roman" w:eastAsia="Times New Roman" w:hAnsi="Times New Roman"/>
-          <w:b w:val="false"/>
-          <w:bCs w:val="false"/>
-          <w:i w:val="false"/>
-          <w:iCs w:val="false"/>
-          <w:sz w:val="22"/>
-          <w:szCs w:val="22"/>
-        </w:rPr>
-        <w:t xml:space="preserve"> with registration number </w:t>
-      </w:r>
-      <w:r>
-        <w:rPr>
-          <w:rFonts w:ascii="Times New Roman" w:cs="Times New Roman" w:eastAsia="Times New Roman" w:hAnsi="Times New Roman"/>
-          <w:b/>
-          <w:bCs/>
-          <w:i w:val="false"/>
-          <w:iCs w:val="false"/>
-          <w:sz w:val="22"/>
-          <w:szCs w:val="22"/>
-        </w:rPr>
-        <w:t xml:space="preserve">[REG NO]</w:t>
-      </w:r>
-      <w:r>
-        <w:rPr>
-          <w:rFonts w:ascii="Times New Roman" w:cs="Times New Roman" w:eastAsia="Times New Roman" w:hAnsi="Times New Roman"/>
-          <w:b w:val="false"/>
-          <w:bCs w:val="false"/>
-          <w:i w:val="false"/>
-          <w:iCs w:val="false"/>
-          <w:sz w:val="22"/>
-          <w:szCs w:val="22"/>
-        </w:rPr>
-        <w:t xml:space="preserve"> / with identity number </w:t>
-      </w:r>
-      <w:r>
-        <w:rPr>
-          <w:rFonts w:ascii="Times New Roman" w:cs="Times New Roman" w:eastAsia="Times New Roman" w:hAnsi="Times New Roman"/>
-          <w:b/>
-          <w:bCs/>
-          <w:i w:val="false"/>
-          <w:iCs w:val="false"/>
-          <w:sz w:val="22"/>
-          <w:szCs w:val="22"/>
-        </w:rPr>
-        <w:t xml:space="preserve">[ID NO]</w:t>
-      </w:r>
-      <w:r>
-        <w:rPr>
-          <w:rFonts w:ascii="Times New Roman" w:cs="Times New Roman" w:eastAsia="Times New Roman" w:hAnsi="Times New Roman"/>
-          <w:b w:val="false"/>
-          <w:bCs w:val="false"/>
-          <w:i w:val="false"/>
-          <w:iCs w:val="false"/>
-          <w:sz w:val="22"/>
-          <w:szCs w:val="22"/>
-        </w:rPr>
-        <w:t xml:space="preserve">], of </w:t>
-      </w:r>
-      <w:r>
-        <w:rPr>
-          <w:rFonts w:ascii="Times New Roman" w:cs="Times New Roman" w:eastAsia="Times New Roman" w:hAnsi="Times New Roman"/>
-          <w:b/>
-          <w:bCs/>
-          <w:i w:val="false"/>
-          <w:iCs w:val="false"/>
-          <w:sz w:val="22"/>
-          <w:szCs w:val="22"/>
-        </w:rPr>
-        <w:t xml:space="preserve">[ADDRESS]</w:t>
-      </w:r>
-      <w:r>
-        <w:rPr>
-          <w:rFonts w:ascii="Times New Roman" w:cs="Times New Roman" w:eastAsia="Times New Roman" w:hAnsi="Times New Roman"/>
-          <w:b w:val="false"/>
-          <w:bCs w:val="false"/>
-          <w:i w:val="false"/>
-          <w:iCs w:val="false"/>
-          <w:sz w:val="22"/>
-          <w:szCs w:val="22"/>
-        </w:rPr>
-        <w:t xml:space="preserve"> (the </w:t>
+        <w:t xml:space="preserve">(2)</w:t>
+      </w:r>
+      <w:r>
+        <w:rPr>
+          <w:rFonts w:ascii="Times New Roman" w:cs="Times New Roman" w:eastAsia="Times New Roman" w:hAnsi="Times New Roman"/>
+          <w:b w:val="false"/>
+          <w:bCs w:val="false"/>
+          <w:i w:val="false"/>
+          <w:iCs w:val="false"/>
+          <w:sz w:val="22"/>
+          <w:szCs w:val="22"/>
+        </w:rPr>
+        <w:t xml:space="preserve"> _______________________________________________________________, with registration number or identity number ______________________________, of _______________________________________________________________ (the </w:t>
       </w:r>
       <w:r>
         <w:rPr>
@@ -4074,18 +3954,6 @@
             <w:pPr>
               <w:spacing w:after="0" w:line="276"/>
             </w:pPr>
-            <w:r>
-              <w:rPr>
-                <w:rFonts w:ascii="Times New Roman" w:cs="Times New Roman" w:eastAsia="Times New Roman" w:hAnsi="Times New Roman"/>
-                <w:b w:val="false"/>
-                <w:bCs w:val="false"/>
-                <w:i w:val="false"/>
-                <w:iCs w:val="false"/>
-                <w:sz w:val="22"/>
-                <w:szCs w:val="22"/>
-              </w:rPr>
-              <w:t xml:space="preserve">[ADDRESS]</w:t>
-            </w:r>
           </w:p>
         </w:tc>
       </w:tr>
@@ -4160,18 +4028,6 @@
             <w:pPr>
               <w:spacing w:after="0" w:line="276"/>
             </w:pPr>
-            <w:r>
-              <w:rPr>
-                <w:rFonts w:ascii="Times New Roman" w:cs="Times New Roman" w:eastAsia="Times New Roman" w:hAnsi="Times New Roman"/>
-                <w:b w:val="false"/>
-                <w:bCs w:val="false"/>
-                <w:i w:val="false"/>
-                <w:iCs w:val="false"/>
-                <w:sz w:val="22"/>
-                <w:szCs w:val="22"/>
-              </w:rPr>
-              <w:t xml:space="preserve">[EMAIL]</w:t>
-            </w:r>
           </w:p>
         </w:tc>
       </w:tr>
@@ -4246,18 +4102,6 @@
             <w:pPr>
               <w:spacing w:after="0" w:line="276"/>
             </w:pPr>
-            <w:r>
-              <w:rPr>
-                <w:rFonts w:ascii="Times New Roman" w:cs="Times New Roman" w:eastAsia="Times New Roman" w:hAnsi="Times New Roman"/>
-                <w:b w:val="false"/>
-                <w:bCs w:val="false"/>
-                <w:i w:val="false"/>
-                <w:iCs w:val="false"/>
-                <w:sz w:val="22"/>
-                <w:szCs w:val="22"/>
-              </w:rPr>
-              <w:t xml:space="preserve">[NAME]</w:t>
-            </w:r>
           </w:p>
         </w:tc>
       </w:tr>
@@ -4969,7 +4813,7 @@
             <w:tcBorders>
               <w:top w:val="none" w:color="FFFFFF" w:sz="0"/>
               <w:left w:val="none" w:color="FFFFFF" w:sz="0"/>
-              <w:bottom w:val="none" w:color="FFFFFF" w:sz="0"/>
+              <w:bottom w:val="single" w:color="555555" w:sz="4"/>
               <w:right w:val="none" w:color="FFFFFF" w:sz="0"/>
             </w:tcBorders>
             <w:tcMar>
@@ -4983,18 +4827,6 @@
             <w:pPr>
               <w:spacing w:after="0"/>
             </w:pPr>
-            <w:r>
-              <w:rPr>
-                <w:rFonts w:ascii="Times New Roman" w:cs="Times New Roman" w:eastAsia="Times New Roman" w:hAnsi="Times New Roman"/>
-                <w:b w:val="false"/>
-                <w:bCs w:val="false"/>
-                <w:i w:val="false"/>
-                <w:iCs w:val="false"/>
-                <w:sz w:val="22"/>
-                <w:szCs w:val="22"/>
-              </w:rPr>
-              <w:t xml:space="preserve">[DATE]</w:t>
-            </w:r>
           </w:p>
         </w:tc>
       </w:tr>
@@ -5039,7 +4871,7 @@
             <w:tcBorders>
               <w:top w:val="none" w:color="FFFFFF" w:sz="0"/>
               <w:left w:val="none" w:color="FFFFFF" w:sz="0"/>
-              <w:bottom w:val="none" w:color="FFFFFF" w:sz="0"/>
+              <w:bottom w:val="single" w:color="555555" w:sz="4"/>
               <w:right w:val="none" w:color="FFFFFF" w:sz="0"/>
             </w:tcBorders>
             <w:tcMar>
@@ -5053,18 +4885,6 @@
             <w:pPr>
               <w:spacing w:after="0"/>
             </w:pPr>
-            <w:r>
-              <w:rPr>
-                <w:rFonts w:ascii="Times New Roman" w:cs="Times New Roman" w:eastAsia="Times New Roman" w:hAnsi="Times New Roman"/>
-                <w:b w:val="false"/>
-                <w:bCs w:val="false"/>
-                <w:i w:val="false"/>
-                <w:iCs w:val="false"/>
-                <w:sz w:val="22"/>
-                <w:szCs w:val="22"/>
-              </w:rPr>
-              <w:t xml:space="preserve">[PLACE]</w:t>
-            </w:r>
           </w:p>
         </w:tc>
       </w:tr>
@@ -5231,7 +5051,7 @@
             <w:tcBorders>
               <w:top w:val="none" w:color="FFFFFF" w:sz="0"/>
               <w:left w:val="none" w:color="FFFFFF" w:sz="0"/>
-              <w:bottom w:val="none" w:color="FFFFFF" w:sz="0"/>
+              <w:bottom w:val="single" w:color="555555" w:sz="4"/>
               <w:right w:val="none" w:color="FFFFFF" w:sz="0"/>
             </w:tcBorders>
             <w:tcMar>
@@ -5245,18 +5065,6 @@
             <w:pPr>
               <w:spacing w:after="0"/>
             </w:pPr>
-            <w:r>
-              <w:rPr>
-                <w:rFonts w:ascii="Times New Roman" w:cs="Times New Roman" w:eastAsia="Times New Roman" w:hAnsi="Times New Roman"/>
-                <w:b w:val="false"/>
-                <w:bCs w:val="false"/>
-                <w:i w:val="false"/>
-                <w:iCs w:val="false"/>
-                <w:sz w:val="22"/>
-                <w:szCs w:val="22"/>
-              </w:rPr>
-              <w:t xml:space="preserve">[NAME]</w:t>
-            </w:r>
           </w:p>
         </w:tc>
       </w:tr>
@@ -5301,7 +5109,7 @@
             <w:tcBorders>
               <w:top w:val="none" w:color="FFFFFF" w:sz="0"/>
               <w:left w:val="none" w:color="FFFFFF" w:sz="0"/>
-              <w:bottom w:val="none" w:color="FFFFFF" w:sz="0"/>
+              <w:bottom w:val="single" w:color="555555" w:sz="4"/>
               <w:right w:val="none" w:color="FFFFFF" w:sz="0"/>
             </w:tcBorders>
             <w:tcMar>
@@ -5315,18 +5123,6 @@
             <w:pPr>
               <w:spacing w:after="0"/>
             </w:pPr>
-            <w:r>
-              <w:rPr>
-                <w:rFonts w:ascii="Times New Roman" w:cs="Times New Roman" w:eastAsia="Times New Roman" w:hAnsi="Times New Roman"/>
-                <w:b w:val="false"/>
-                <w:bCs w:val="false"/>
-                <w:i w:val="false"/>
-                <w:iCs w:val="false"/>
-                <w:sz w:val="22"/>
-                <w:szCs w:val="22"/>
-              </w:rPr>
-              <w:t xml:space="preserve">[CAPACITY — duly authorised]</w:t>
-            </w:r>
           </w:p>
         </w:tc>
       </w:tr>
@@ -5371,7 +5167,7 @@
             <w:tcBorders>
               <w:top w:val="none" w:color="FFFFFF" w:sz="0"/>
               <w:left w:val="none" w:color="FFFFFF" w:sz="0"/>
-              <w:bottom w:val="none" w:color="FFFFFF" w:sz="0"/>
+              <w:bottom w:val="single" w:color="555555" w:sz="4"/>
               <w:right w:val="none" w:color="FFFFFF" w:sz="0"/>
             </w:tcBorders>
             <w:tcMar>
@@ -5385,18 +5181,6 @@
             <w:pPr>
               <w:spacing w:after="0"/>
             </w:pPr>
-            <w:r>
-              <w:rPr>
-                <w:rFonts w:ascii="Times New Roman" w:cs="Times New Roman" w:eastAsia="Times New Roman" w:hAnsi="Times New Roman"/>
-                <w:b w:val="false"/>
-                <w:bCs w:val="false"/>
-                <w:i w:val="false"/>
-                <w:iCs w:val="false"/>
-                <w:sz w:val="22"/>
-                <w:szCs w:val="22"/>
-              </w:rPr>
-              <w:t xml:space="preserve">[DATE]</w:t>
-            </w:r>
           </w:p>
         </w:tc>
       </w:tr>
@@ -5441,7 +5225,7 @@
             <w:tcBorders>
               <w:top w:val="none" w:color="FFFFFF" w:sz="0"/>
               <w:left w:val="none" w:color="FFFFFF" w:sz="0"/>
-              <w:bottom w:val="none" w:color="FFFFFF" w:sz="0"/>
+              <w:bottom w:val="single" w:color="555555" w:sz="4"/>
               <w:right w:val="none" w:color="FFFFFF" w:sz="0"/>
             </w:tcBorders>
             <w:tcMar>
@@ -5455,18 +5239,6 @@
             <w:pPr>
               <w:spacing w:after="0"/>
             </w:pPr>
-            <w:r>
-              <w:rPr>
-                <w:rFonts w:ascii="Times New Roman" w:cs="Times New Roman" w:eastAsia="Times New Roman" w:hAnsi="Times New Roman"/>
-                <w:b w:val="false"/>
-                <w:bCs w:val="false"/>
-                <w:i w:val="false"/>
-                <w:iCs w:val="false"/>
-                <w:sz w:val="22"/>
-                <w:szCs w:val="22"/>
-              </w:rPr>
-              <w:t xml:space="preserve">[PLACE]</w:t>
-            </w:r>
           </w:p>
         </w:tc>
       </w:tr>

</xml_diff>